<commit_message>
test(docx): cover note picture-bullet and cap edge cases
</commit_message>
<xml_diff>
--- a/testdata/docx/breaks.docx
+++ b/testdata/docx/breaks.docx
@@ -52,6 +52,14 @@
       <w:lvlRestart w:val="0"/>
     </w:lvl>
   </w:abstractNum>
+  <w:abstractNum w:abstractNumId="2">
+    <w:lvl w:ilvl="0">
+      <w:start w:val="1"/>
+      <w:numFmt w:val="bullet"/>
+      <w:lvlText w:val="x"/>
+      <w:lvlPicBulletId w:val="7"/>
+    </w:lvl>
+  </w:abstractNum>
   <w:num w:numId="10">
     <w:abstractNumId w:val="1"/>
   </w:num>
@@ -60,6 +68,9 @@
     <w:lvlOverride w:ilvl="0">
       <w:startOverride w:val="3"/>
     </w:lvlOverride>
+  </w:num>
+  <w:num w:numId="12">
+    <w:abstractNumId w:val="2"/>
   </w:num>
 </w:numbering>
 </file>

</xml_diff>